<commit_message>
feat(讲义): add listening tapescripts to all 15 listening sections
Add 听力录音原文（Tapescript）boxes for every lecture that has a
Listening part (lectures 1-6, 8-16; 7/17/18 have no listening), so the
listening exercises are now self-contained and answers are reproducible.
Scripts are written to match the given answer keys.

Adds Jiangyi.tapescript() to the style library. All six files rebuilt
and validate clean with officecli.
</commit_message>
<xml_diff>
--- a/26秋7年级讲义/【26秋】7年级讲义（第1-3讲）.docx
+++ b/26秋7年级讲义/【26秋】7年级讲义（第1-3讲）.docx
@@ -10422,6 +10422,137 @@
       <w:tblPr>
         <w:tblW w:type="auto" w:w="0"/>
         <w:tblBorders>
+          <w:top w:val="single" w:sz="12" w:space="0" w:color="F6B35C"/>
+          <w:left w:val="single" w:sz="12" w:space="0" w:color="F6B35C"/>
+          <w:bottom w:val="single" w:sz="12" w:space="0" w:color="F6B35C"/>
+          <w:right w:val="single" w:sz="12" w:space="0" w:color="F6B35C"/>
+          <w:insideH w:val="single" w:sz="12" w:space="0" w:color="F6B35C"/>
+          <w:insideV w:val="single" w:sz="12" w:space="0" w:color="F6B35C"/>
+        </w:tblBorders>
+        <w:tblLayout w:type="fixed"/>
+        <w:tblLook w:firstColumn="1" w:firstRow="1" w:lastColumn="0" w:lastRow="0" w:noHBand="0" w:noVBand="1" w:val="04A0"/>
+      </w:tblPr>
+      <w:tblGrid>
+        <w:gridCol w:w="9412"/>
+      </w:tblGrid>
+      <w:tr>
+        <w:tc>
+          <w:tcPr>
+            <w:tcW w:type="dxa" w:w="9411"/>
+            <w:shd w:val="clear" w:color="auto" w:fill="FFF3E2"/>
+          </w:tcPr>
+          <w:p>
+            <w:pPr>
+              <w:spacing w:after="40"/>
+            </w:pPr>
+            <w:r>
+              <w:rPr>
+                <w:rFonts w:ascii="Calibri" w:hAnsi="Calibri" w:eastAsia="微软雅黑"/>
+                <w:b/>
+                <w:i w:val="0"/>
+                <w:color w:val="F08A24"/>
+                <w:sz w:val="22"/>
+              </w:rPr>
+              <w:t xml:space="preserve">💡 </w:t>
+            </w:r>
+            <w:r>
+              <w:rPr>
+                <w:rFonts w:ascii="Calibri" w:hAnsi="Calibri" w:eastAsia="微软雅黑"/>
+                <w:b/>
+                <w:i w:val="0"/>
+                <w:color w:val="F08A24"/>
+                <w:sz w:val="22"/>
+              </w:rPr>
+              <w:t>🎧 听力录音原文（Tapescript）</w:t>
+            </w:r>
+          </w:p>
+          <w:p>
+            <w:pPr>
+              <w:spacing w:after="40" w:line="300" w:lineRule="auto"/>
+            </w:pPr>
+            <w:r>
+              <w:rPr>
+                <w:rFonts w:ascii="Calibri" w:hAnsi="Calibri" w:eastAsia="微软雅黑"/>
+                <w:b w:val="0"/>
+                <w:i w:val="0"/>
+                <w:color w:val="222222"/>
+                <w:sz w:val="19"/>
+              </w:rPr>
+              <w:t>1. W: Excuse me, where shall we meet tomorrow morning?  M: Let's meet at the school gate at eight.</w:t>
+            </w:r>
+          </w:p>
+          <w:p>
+            <w:pPr>
+              <w:spacing w:after="40" w:line="300" w:lineRule="auto"/>
+            </w:pPr>
+            <w:r>
+              <w:rPr>
+                <w:rFonts w:ascii="Calibri" w:hAnsi="Calibri" w:eastAsia="微软雅黑"/>
+                <w:b w:val="0"/>
+                <w:i w:val="0"/>
+                <w:color w:val="222222"/>
+                <w:sz w:val="19"/>
+              </w:rPr>
+              <w:t>2. M: How much is the ticket for each student?  W: It's ten yuan.</w:t>
+            </w:r>
+          </w:p>
+          <w:p>
+            <w:pPr>
+              <w:spacing w:after="40" w:line="300" w:lineRule="auto"/>
+            </w:pPr>
+            <w:r>
+              <w:rPr>
+                <w:rFonts w:ascii="Calibri" w:hAnsi="Calibri" w:eastAsia="微软雅黑"/>
+                <w:b w:val="0"/>
+                <w:i w:val="0"/>
+                <w:color w:val="222222"/>
+                <w:sz w:val="19"/>
+              </w:rPr>
+              <w:t>3. W: What time will the film begin?  M: At three o'clock. Don't be late.</w:t>
+            </w:r>
+          </w:p>
+          <w:p>
+            <w:pPr>
+              <w:spacing w:after="40" w:line="300" w:lineRule="auto"/>
+            </w:pPr>
+            <w:r>
+              <w:rPr>
+                <w:rFonts w:ascii="Calibri" w:hAnsi="Calibri" w:eastAsia="微软雅黑"/>
+                <w:b w:val="0"/>
+                <w:i w:val="0"/>
+                <w:color w:val="222222"/>
+                <w:sz w:val="19"/>
+              </w:rPr>
+              <w:t>4. W: What do you want to be when you grow up, Jack?  M: I want to be a teacher, like my mother.</w:t>
+            </w:r>
+          </w:p>
+          <w:p>
+            <w:pPr>
+              <w:spacing w:after="40" w:line="300" w:lineRule="auto"/>
+            </w:pPr>
+            <w:r>
+              <w:rPr>
+                <w:rFonts w:ascii="Calibri" w:hAnsi="Calibri" w:eastAsia="微软雅黑"/>
+                <w:b w:val="0"/>
+                <w:i w:val="0"/>
+                <w:color w:val="222222"/>
+                <w:sz w:val="19"/>
+              </w:rPr>
+              <w:t>5. M: How will we go to the park?  W: It's a little far. Let's go by bus.</w:t>
+            </w:r>
+          </w:p>
+        </w:tc>
+      </w:tr>
+    </w:tbl>
+    <w:p>
+      <w:pPr>
+        <w:spacing w:before="0" w:after="40" w:line="312" w:lineRule="auto"/>
+      </w:pPr>
+    </w:p>
+    <w:tbl>
+      <w:tblPr>
+        <w:tblW w:type="auto" w:w="0"/>
+        <w:tblBorders>
           <w:top w:val="single" w:sz="12" w:space="0" w:color="16A39A"/>
           <w:left w:val="single" w:sz="12" w:space="0" w:color="16A39A"/>
           <w:bottom w:val="single" w:sz="12" w:space="0" w:color="16A39A"/>
@@ -17969,6 +18100,182 @@
       <w:tblPr>
         <w:tblW w:type="auto" w:w="0"/>
         <w:tblBorders>
+          <w:top w:val="single" w:sz="12" w:space="0" w:color="F6B35C"/>
+          <w:left w:val="single" w:sz="12" w:space="0" w:color="F6B35C"/>
+          <w:bottom w:val="single" w:sz="12" w:space="0" w:color="F6B35C"/>
+          <w:right w:val="single" w:sz="12" w:space="0" w:color="F6B35C"/>
+          <w:insideH w:val="single" w:sz="12" w:space="0" w:color="F6B35C"/>
+          <w:insideV w:val="single" w:sz="12" w:space="0" w:color="F6B35C"/>
+        </w:tblBorders>
+        <w:tblLayout w:type="fixed"/>
+        <w:tblLook w:firstColumn="1" w:firstRow="1" w:lastColumn="0" w:lastRow="0" w:noHBand="0" w:noVBand="1" w:val="04A0"/>
+      </w:tblPr>
+      <w:tblGrid>
+        <w:gridCol w:w="9412"/>
+      </w:tblGrid>
+      <w:tr>
+        <w:tc>
+          <w:tcPr>
+            <w:tcW w:type="dxa" w:w="9411"/>
+            <w:shd w:val="clear" w:color="auto" w:fill="FFF3E2"/>
+          </w:tcPr>
+          <w:p>
+            <w:pPr>
+              <w:spacing w:after="40"/>
+            </w:pPr>
+            <w:r>
+              <w:rPr>
+                <w:rFonts w:ascii="Calibri" w:hAnsi="Calibri" w:eastAsia="微软雅黑"/>
+                <w:b/>
+                <w:i w:val="0"/>
+                <w:color w:val="F08A24"/>
+                <w:sz w:val="22"/>
+              </w:rPr>
+              <w:t xml:space="preserve">💡 </w:t>
+            </w:r>
+            <w:r>
+              <w:rPr>
+                <w:rFonts w:ascii="Calibri" w:hAnsi="Calibri" w:eastAsia="微软雅黑"/>
+                <w:b/>
+                <w:i w:val="0"/>
+                <w:color w:val="F08A24"/>
+                <w:sz w:val="22"/>
+              </w:rPr>
+              <w:t>🎧 听力录音原文（Tapescript）</w:t>
+            </w:r>
+          </w:p>
+          <w:p>
+            <w:pPr>
+              <w:spacing w:after="40" w:line="300" w:lineRule="auto"/>
+            </w:pPr>
+            <w:r>
+              <w:rPr>
+                <w:rFonts w:ascii="Calibri" w:hAnsi="Calibri" w:eastAsia="微软雅黑"/>
+                <w:b w:val="0"/>
+                <w:i w:val="0"/>
+                <w:color w:val="222222"/>
+                <w:sz w:val="19"/>
+              </w:rPr>
+              <w:t>W: The Mid-Autumn Festival is coming. What shall we do, Dad?</w:t>
+            </w:r>
+          </w:p>
+          <w:p>
+            <w:pPr>
+              <w:spacing w:after="40" w:line="300" w:lineRule="auto"/>
+            </w:pPr>
+            <w:r>
+              <w:rPr>
+                <w:rFonts w:ascii="Calibri" w:hAnsi="Calibri" w:eastAsia="微软雅黑"/>
+                <w:b w:val="0"/>
+                <w:i w:val="0"/>
+                <w:color w:val="222222"/>
+                <w:sz w:val="19"/>
+              </w:rPr>
+              <w:t>M: Let's visit your grandparents. They live in the countryside.</w:t>
+            </w:r>
+          </w:p>
+          <w:p>
+            <w:pPr>
+              <w:spacing w:after="40" w:line="300" w:lineRule="auto"/>
+            </w:pPr>
+            <w:r>
+              <w:rPr>
+                <w:rFonts w:ascii="Calibri" w:hAnsi="Calibri" w:eastAsia="微软雅黑"/>
+                <w:b w:val="0"/>
+                <w:i w:val="0"/>
+                <w:color w:val="222222"/>
+                <w:sz w:val="19"/>
+              </w:rPr>
+              <w:t>W: Great! When shall we go? On Saturday?</w:t>
+            </w:r>
+          </w:p>
+          <w:p>
+            <w:pPr>
+              <w:spacing w:after="40" w:line="300" w:lineRule="auto"/>
+            </w:pPr>
+            <w:r>
+              <w:rPr>
+                <w:rFonts w:ascii="Calibri" w:hAnsi="Calibri" w:eastAsia="微软雅黑"/>
+                <w:b w:val="0"/>
+                <w:i w:val="0"/>
+                <w:color w:val="222222"/>
+                <w:sz w:val="19"/>
+              </w:rPr>
+              <w:t>M: I have to work on Saturday. Let's go on Sunday.</w:t>
+            </w:r>
+          </w:p>
+          <w:p>
+            <w:pPr>
+              <w:spacing w:after="40" w:line="300" w:lineRule="auto"/>
+            </w:pPr>
+            <w:r>
+              <w:rPr>
+                <w:rFonts w:ascii="Calibri" w:hAnsi="Calibri" w:eastAsia="微软雅黑"/>
+                <w:b w:val="0"/>
+                <w:i w:val="0"/>
+                <w:color w:val="222222"/>
+                <w:sz w:val="19"/>
+              </w:rPr>
+              <w:t>W: How will we get there? By train?</w:t>
+            </w:r>
+          </w:p>
+          <w:p>
+            <w:pPr>
+              <w:spacing w:after="40" w:line="300" w:lineRule="auto"/>
+            </w:pPr>
+            <w:r>
+              <w:rPr>
+                <w:rFonts w:ascii="Calibri" w:hAnsi="Calibri" w:eastAsia="微软雅黑"/>
+                <w:b w:val="0"/>
+                <w:i w:val="0"/>
+                <w:color w:val="222222"/>
+                <w:sz w:val="19"/>
+              </w:rPr>
+              <w:t>M: No, by car. It's faster. And we should buy some moon cakes for them.</w:t>
+            </w:r>
+          </w:p>
+          <w:p>
+            <w:pPr>
+              <w:spacing w:after="40" w:line="300" w:lineRule="auto"/>
+            </w:pPr>
+            <w:r>
+              <w:rPr>
+                <w:rFonts w:ascii="Calibri" w:hAnsi="Calibri" w:eastAsia="微软雅黑"/>
+                <w:b w:val="0"/>
+                <w:i w:val="0"/>
+                <w:color w:val="222222"/>
+                <w:sz w:val="19"/>
+              </w:rPr>
+              <w:t>W: Good idea — they love moon cakes! We'll leave early in the morning, right?</w:t>
+            </w:r>
+          </w:p>
+          <w:p>
+            <w:pPr>
+              <w:spacing w:after="40" w:line="300" w:lineRule="auto"/>
+            </w:pPr>
+            <w:r>
+              <w:rPr>
+                <w:rFonts w:ascii="Calibri" w:hAnsi="Calibri" w:eastAsia="微软雅黑"/>
+                <w:b w:val="0"/>
+                <w:i w:val="0"/>
+                <w:color w:val="222222"/>
+                <w:sz w:val="19"/>
+              </w:rPr>
+              <w:t>M: Yes. Please remind me.  W: OK, Dad, please get up early and don't oversleep!</w:t>
+            </w:r>
+          </w:p>
+        </w:tc>
+      </w:tr>
+    </w:tbl>
+    <w:p>
+      <w:pPr>
+        <w:spacing w:before="0" w:after="40" w:line="312" w:lineRule="auto"/>
+      </w:pPr>
+    </w:p>
+    <w:tbl>
+      <w:tblPr>
+        <w:tblW w:type="auto" w:w="0"/>
+        <w:tblBorders>
           <w:top w:val="single" w:sz="12" w:space="0" w:color="16A39A"/>
           <w:left w:val="single" w:sz="12" w:space="0" w:color="16A39A"/>
           <w:bottom w:val="single" w:sz="12" w:space="0" w:color="16A39A"/>
@@ -21028,6 +21335,107 @@
         </w:rPr>
         <w:t>________________________________________________________</w:t>
       </w:r>
+    </w:p>
+    <w:tbl>
+      <w:tblPr>
+        <w:tblW w:type="auto" w:w="0"/>
+        <w:tblBorders>
+          <w:top w:val="single" w:sz="12" w:space="0" w:color="F6B35C"/>
+          <w:left w:val="single" w:sz="12" w:space="0" w:color="F6B35C"/>
+          <w:bottom w:val="single" w:sz="12" w:space="0" w:color="F6B35C"/>
+          <w:right w:val="single" w:sz="12" w:space="0" w:color="F6B35C"/>
+          <w:insideH w:val="single" w:sz="12" w:space="0" w:color="F6B35C"/>
+          <w:insideV w:val="single" w:sz="12" w:space="0" w:color="F6B35C"/>
+        </w:tblBorders>
+        <w:tblLayout w:type="fixed"/>
+        <w:tblLook w:firstColumn="1" w:firstRow="1" w:lastColumn="0" w:lastRow="0" w:noHBand="0" w:noVBand="1" w:val="04A0"/>
+      </w:tblPr>
+      <w:tblGrid>
+        <w:gridCol w:w="9412"/>
+      </w:tblGrid>
+      <w:tr>
+        <w:tc>
+          <w:tcPr>
+            <w:tcW w:type="dxa" w:w="9411"/>
+            <w:shd w:val="clear" w:color="auto" w:fill="FFF3E2"/>
+          </w:tcPr>
+          <w:p>
+            <w:pPr>
+              <w:spacing w:after="40"/>
+            </w:pPr>
+            <w:r>
+              <w:rPr>
+                <w:rFonts w:ascii="Calibri" w:hAnsi="Calibri" w:eastAsia="微软雅黑"/>
+                <w:b/>
+                <w:i w:val="0"/>
+                <w:color w:val="F08A24"/>
+                <w:sz w:val="22"/>
+              </w:rPr>
+              <w:t xml:space="preserve">💡 </w:t>
+            </w:r>
+            <w:r>
+              <w:rPr>
+                <w:rFonts w:ascii="Calibri" w:hAnsi="Calibri" w:eastAsia="微软雅黑"/>
+                <w:b/>
+                <w:i w:val="0"/>
+                <w:color w:val="F08A24"/>
+                <w:sz w:val="22"/>
+              </w:rPr>
+              <w:t>🎧 听力录音原文（Tapescript）</w:t>
+            </w:r>
+          </w:p>
+          <w:p>
+            <w:pPr>
+              <w:spacing w:after="40" w:line="300" w:lineRule="auto"/>
+            </w:pPr>
+            <w:r>
+              <w:rPr>
+                <w:rFonts w:ascii="Calibri" w:hAnsi="Calibri" w:eastAsia="微软雅黑"/>
+                <w:b w:val="0"/>
+                <w:i w:val="0"/>
+                <w:color w:val="222222"/>
+                <w:sz w:val="19"/>
+              </w:rPr>
+              <w:t>Hello, everyone. Let me tell you something about my family. There are four people in my family: my father, my mother, my elder sister and I.</w:t>
+            </w:r>
+          </w:p>
+          <w:p>
+            <w:pPr>
+              <w:spacing w:after="40" w:line="300" w:lineRule="auto"/>
+            </w:pPr>
+            <w:r>
+              <w:rPr>
+                <w:rFonts w:ascii="Calibri" w:hAnsi="Calibri" w:eastAsia="微软雅黑"/>
+                <w:b w:val="0"/>
+                <w:i w:val="0"/>
+                <w:color w:val="222222"/>
+                <w:sz w:val="19"/>
+              </w:rPr>
+              <w:t>My father is a bus driver. He is tall and he likes listening to music. My mother is a nurse. She has long curly hair and she is good at cooking. My sister is a middle school student; she likes singing and dancing.</w:t>
+            </w:r>
+          </w:p>
+          <w:p>
+            <w:pPr>
+              <w:spacing w:after="40" w:line="300" w:lineRule="auto"/>
+            </w:pPr>
+            <w:r>
+              <w:rPr>
+                <w:rFonts w:ascii="Calibri" w:hAnsi="Calibri" w:eastAsia="微软雅黑"/>
+                <w:b w:val="0"/>
+                <w:i w:val="0"/>
+                <w:color w:val="222222"/>
+                <w:sz w:val="19"/>
+              </w:rPr>
+              <w:t>I love my family very much. We are very happy together. That's all. Thank you.</w:t>
+            </w:r>
+          </w:p>
+        </w:tc>
+      </w:tr>
+    </w:tbl>
+    <w:p>
+      <w:pPr>
+        <w:spacing w:before="0" w:after="40" w:line="312" w:lineRule="auto"/>
+      </w:pPr>
     </w:p>
     <w:tbl>
       <w:tblPr>

</xml_diff>